<commit_message>
Improve RAG retrieval evaluation and evidence handling
Co-authored-by: Copilot <223556219+Copilot@users.noreply.github.com>
</commit_message>
<xml_diff>
--- a/docs/reports/Bao_cao_tien_do.docx
+++ b/docs/reports/Bao_cao_tien_do.docx
@@ -60,11 +60,7 @@
         <w:jc w:val="center"/>
       </w:pPr>
       <w:r>
-        <w:rPr>
-          <w:color w:val="17365D"/>
-          <w:sz w:val="22"/>
-        </w:rPr>
-        <w:t>Phiên bản báo cáo: 1.0</w:t>
+        <w:t>Phiên bản báo cáo: 1.3</w:t>
         <w:br/>
         <w:t>Ngày lập: 27/10/2026</w:t>
         <w:br/>
@@ -77,11 +73,7 @@
         <w:shd w:fill="EEF5FB"/>
       </w:pPr>
       <w:r>
-        <w:rPr>
-          <w:color w:val="17365D"/>
-          <w:sz w:val="17"/>
-        </w:rPr>
-        <w:t>TRẠNG THÁI TỔNG QUAN: NỀN TẢNG LOCAL ĐÃ HOÀN THÀNH; RAG/LLM LÀ LỘ TRÌNH TIẾP THEO</w:t>
+        <w:t>TRẠNG THÁI TỔNG QUAN: NỀN TẢNG LOCAL VÀ KHO RAG BAN ĐẦU ĐÃ CÓ; RETRIEVAL CHƯA ĐẠT ĐỂ DÙNG CHO CHATBOT Y KHOA</w:t>
       </w:r>
     </w:p>
     <w:p>
@@ -376,7 +368,7 @@
         <w:spacing w:after="40"/>
       </w:pPr>
       <w:r>
-        <w:t>**Chưa được tuyên bố:** notebook parity đầy đủ, accuracy lâm sàng, xác suất đã hiệu</w:t>
+        <w:t>**Đã triển khai thêm:** 12 nguồn NCI, hiện 416 đoạn; embedding, BM25, mở rộng Việt–Anh và chỉ mục local.</w:t>
       </w:r>
     </w:p>
     <w:p>
@@ -384,7 +376,7 @@
         <w:spacing w:after="100" w:line="259" w:lineRule="auto"/>
       </w:pPr>
       <w:r>
-        <w:t>chuẩn, chẩn đoán y khoa, triển khai public có xác thực, RAG hoặc LLM.</w:t>
+        <w:t>Giai đoạn 11 chưa đạt yêu cầu truy xuất và từ chối câu ngoài phạm vi.</w:t>
       </w:r>
     </w:p>
     <w:p>
@@ -393,7 +385,7 @@
         <w:spacing w:after="40"/>
       </w:pPr>
       <w:r>
-        <w:t>**Cần phát triển tiếp:** kho tài liệu y khoa, embeddings, vector index, chatbot,</w:t>
+        <w:t>**Chưa được tuyên bố:** notebook parity đầy đủ, độ chính xác lâm sàng, điểm số đã hiệu chuẩn,</w:t>
       </w:r>
     </w:p>
     <w:p>
@@ -401,7 +393,7 @@
         <w:spacing w:after="100" w:line="259" w:lineRule="auto"/>
       </w:pPr>
       <w:r>
-        <w:t>đánh giá toàn diện, bảo mật triển khai và tài liệu/slide bàn giao cuối.</w:t>
+        <w:t>chẩn đoán y khoa, triển khai public có xác thực hoặc chatbot đã nghiệm thu.</w:t>
       </w:r>
     </w:p>
     <w:p>
@@ -3651,7 +3643,7 @@
         <w:pStyle w:val="Heading2"/>
       </w:pPr>
       <w:r>
-        <w:t>10. Xây kho tài liệu y khoa cho RAG (giai đoạn tiếp theo)</w:t>
+        <w:t>10. Xây kho tài liệu y khoa cho RAG</w:t>
       </w:r>
     </w:p>
     <w:p>
@@ -3659,11 +3651,7 @@
         <w:ind w:left="288"/>
       </w:pPr>
       <w:r>
-        <w:rPr>
-          <w:i/>
-          <w:color w:val="595959"/>
-        </w:rPr>
-        <w:t>Giai đoạn này **chưa được coi là hoàn thành** trong bản hiện tại.</w:t>
+        <w:t>Đã tạo kho 12 nguồn NCI và 416 đoạn sau sửa trích xuất; cần mở rộng độ phủ và rà soát chuyên môn.</w:t>
       </w:r>
     </w:p>
     <w:p>
@@ -3829,27 +3817,21 @@
         <w:shd w:fill="F3F4F6"/>
       </w:pPr>
       <w:r>
-        <w:rPr>
-          <w:rFonts w:ascii="Consolas" w:hAnsi="Consolas" w:eastAsia="Consolas"/>
-          <w:sz w:val="16"/>
-        </w:rPr>
         <w:t>[COMPLETION NOTE — GĐ10]</w:t>
         <w:br/>
-        <w:t>Ngày/giờ:</w:t>
+        <w:t>Ngày: 27/10/2026</w:t>
         <w:br/>
-        <w:t>Số tài liệu:</w:t>
+        <w:t>Nguồn: 12 trang NCI, hiện 416 đoạn văn bản</w:t>
         <w:br/>
-        <w:t>Nguồn/giấy phép:</w:t>
+        <w:t>Đã sửa h5/h6, References, khoảng trắng và danh sách ngắn</w:t>
         <w:br/>
-        <w:t>Pipeline trích xuất/chunk:</w:t>
+        <w:t>Pipeline: rag/build_corpus.py; dữ liệu tại rag/data</w:t>
         <w:br/>
-        <w:t>Metadata/citation:</w:t>
+        <w:t>Citation: URL, source_id, section, thời điểm, mã băm</w:t>
         <w:br/>
-        <w:t>Bộ câu hỏi kiểm thử:</w:t>
+        <w:t>Đánh giá: 12 câu regression và 28 câu dev/test V2</w:t>
         <w:br/>
-        <w:t>Rủi ro pháp lý/y khoa:</w:t>
-        <w:br/>
-        <w:t>Trạng thái: PASS / BLOCKED</w:t>
+        <w:t>Trạng thái: PASS kỹ thuật kho nguồn; cần rà soát chuyên môn</w:t>
       </w:r>
     </w:p>
     <w:p>
@@ -3865,11 +3847,7 @@
         <w:ind w:left="288"/>
       </w:pPr>
       <w:r>
-        <w:rPr>
-          <w:i/>
-          <w:color w:val="595959"/>
-        </w:rPr>
-        <w:t>Giai đoạn này **chưa được coi là hoàn thành** trong bản hiện tại.</w:t>
+        <w:t>Đã xây chỉ mục cục bộ và evaluator; kết quả hiện chưa đủ để dùng cho chatbot y khoa.</w:t>
       </w:r>
     </w:p>
     <w:p>
@@ -4044,27 +4022,23 @@
         <w:shd w:fill="F3F4F6"/>
       </w:pPr>
       <w:r>
-        <w:rPr>
-          <w:rFonts w:ascii="Consolas" w:hAnsi="Consolas" w:eastAsia="Consolas"/>
-          <w:sz w:val="16"/>
-        </w:rPr>
         <w:t>[COMPLETION NOTE — GĐ11]</w:t>
         <w:br/>
-        <w:t>Ngày/giờ:</w:t>
+        <w:t>Ngày: 27/10/2026</w:t>
         <w:br/>
-        <w:t>Embedding model/version:</w:t>
+        <w:t>Index local: 416 x 384; hybrid mặc định đúng 8/10 câu cũ</w:t>
         <w:br/>
-        <w:t>Vector store:</w:t>
+        <w:t>Rerank opt-in: 10/10 câu cũ, 8/8 V2 test đã xem, 9/10 V3</w:t>
         <w:br/>
-        <w:t>Index version/checksum:</w:t>
+        <w:t>Lọc từ vựng: chặn nhầm 5/10 câu dương V3; không đạt</w:t>
         <w:br/>
-        <w:t>Top-k/threshold:</w:t>
+        <w:t>Kiểm thử RAG: 20/20 đạt; answer_ready luôn false</w:t>
         <w:br/>
-        <w:t>Kết quả retrieval evaluation:</w:t>
+        <w:t>Báo cáo: docs/reference/stage11_evidence_rank_20261027</w:t>
         <w:br/>
-        <w:t>Truy xuất citation có thể tái lập: Có/Không</w:t>
+        <w:t>Thiếu kiểm định độc lập và kiểm tra đủ bằng chứng</w:t>
         <w:br/>
-        <w:t>Vấn đề:</w:t>
+        <w:t>Trạng thái: BLOCKED cho chatbot y khoa</w:t>
       </w:r>
     </w:p>
     <w:p>
@@ -4860,6 +4834,270 @@
         <w:t>- Giới hạn/known issue:</w:t>
         <w:br/>
         <w:t>- Quyết định tiếp theo:</w:t>
+      </w:r>
+    </w:p>
+    <w:p>
+      <w:r>
+        <w:br w:type="page"/>
+      </w:r>
+    </w:p>
+    <w:p>
+      <w:pPr>
+        <w:pStyle w:val="Heading2"/>
+      </w:pPr>
+      <w:r>
+        <w:t>Phụ lục C  Cập nhật tiến độ ngày 27 tháng 10 năm 2026</w:t>
+      </w:r>
+    </w:p>
+    <w:p>
+      <w:r>
+        <w:t>Phụ lục này tổng hợp phần việc sau bản báo cáo 1.0, cập nhật đến vòng giai đoạn 11 của bản 1.2. Chi tiết bàn giao nằm tại docs/PROJECT_STATUS_VI.md và docs/STAGE11_HANDOFF_VI.md.</w:t>
+      </w:r>
+    </w:p>
+    <w:p>
+      <w:pPr>
+        <w:pStyle w:val="Heading3"/>
+      </w:pPr>
+      <w:r>
+        <w:t>Thay đổi đã triển khai</w:t>
+      </w:r>
+    </w:p>
+    <w:p>
+      <w:pPr>
+        <w:pStyle w:val="ListBullet"/>
+      </w:pPr>
+      <w:r>
+        <w:t>API lưu ca dùng prediction_id do máy chủ cấp sau /predict; /cases chỉ lưu kết quả đã giữ tạm, một lần trong 10 phút. Giao diện xử lý text an toàn và lịch sử ca có phân trang.</w:t>
+      </w:r>
+    </w:p>
+    <w:p>
+      <w:pPr>
+        <w:pStyle w:val="ListBullet"/>
+      </w:pPr>
+      <w:r>
+        <w:t>Tài liệu chuyển vào docs/guides, docs/reports và docs/reference; dữ liệu RAG chuyển vào rag/data. Đường dẫn trong mã và README đã được cập nhật.</w:t>
+      </w:r>
+    </w:p>
+    <w:p>
+      <w:pPr>
+        <w:pStyle w:val="ListBullet"/>
+      </w:pPr>
+      <w:r>
+        <w:t>Kho RAG hiện gồm 12 trang NCI và 416 đoạn có URL, mục, thời điểm truy cập và mã băm. Giữ 12 câu regression và thêm 28 câu dev/test có khóa bằng chứng theo mã băm.</w:t>
+      </w:r>
+    </w:p>
+    <w:p>
+      <w:pPr>
+        <w:pStyle w:val="ListBullet"/>
+      </w:pPr>
+      <w:r>
+        <w:t>Embedding E5 small, mở rộng từ khóa Việt–Anh và BM25 chạy cục bộ, kết hợp bằng RRF. Index có 416 vector, 384 chiều; manifest schema 2 kiểm tra cả tokenizer/pooling/config.</w:t>
+      </w:r>
+    </w:p>
+    <w:p>
+      <w:pPr>
+        <w:pStyle w:val="Heading3"/>
+      </w:pPr>
+      <w:r>
+        <w:t>Kết quả kiểm tra và giới hạn</w:t>
+      </w:r>
+    </w:p>
+    <w:p>
+      <w:r>
+        <w:t>Vòng RAG mới nhất có 20/20 bài kiểm thử đạt; xem cập nhật mới tại Phụ lục E. Vòng kiểm tra ứng dụng trước đó có 4 bài tests, 11 bài api_tests và 1 bài ui_tests đạt; không chạy lại chúng trong vòng sửa RAG. Trên bộ cũ, baseline trước sửa đạt 6/10; hiện hybrid đạt 8/10 đúng nguồn/mục, MRR@5 0,700, routing từ chối 2/2 câu âm. V2 test đạt 7/8 đúng đoạn bằng chứng và từ chối 4/6 câu âm. Bộ V2 do AI soạn và chưa được thẩm định độc lập; chưa có ngưỡng cosine được kiểm định.</w:t>
+      </w:r>
+    </w:p>
+    <w:p>
+      <w:r>
+        <w:t>verify_api.py chưa so sánh lại ba ca tham chiếu sau lần sắp xếp file vì lần chạy gần nhất không có server tại 127.0.0.1:8000. Bài kiểm thử API tự động dùng predictor giả. Các nhãn như simple bone cyst, osteofibroma và synovial osteochondroma còn thiếu nguồn chuyên biệt.</w:t>
+      </w:r>
+    </w:p>
+    <w:p>
+      <w:pPr>
+        <w:pStyle w:val="Heading3"/>
+      </w:pPr>
+      <w:r>
+        <w:t>Công việc tiếp theo</w:t>
+      </w:r>
+    </w:p>
+    <w:p>
+      <w:r>
+        <w:t>Hoàn thiện giai đoạn 11 bằng cách rà soát câu truy xuất sai, bổ sung nguồn, mở rộng và tách bộ câu hỏi để hiệu chỉnh và đánh giá. Chạy lại chỉ mục và evaluator sau mỗi thay đổi corpus. Sau đó khởi động ứng dụng và chạy verify_api.py với model thật.</w:t>
+      </w:r>
+    </w:p>
+    <w:p>
+      <w:r>
+        <w:t>Có thể bắt đầu bản thử nghiệm chatbot tại giai đoạn 12 khi retrieval đủ tin cậy. Nghiệm thu chatbot cần câu trả lời tiếng Việt bám nguồn, citation đúng, cơ chế từ chối khi thiếu bằng chứng và kiểm thử prompt injection, thông tin bệnh nhân, yêu cầu chẩn đoán hoặc phác đồ cá nhân hóa.</w:t>
+      </w:r>
+    </w:p>
+    <w:p>
+      <w:r>
+        <w:br w:type="page"/>
+      </w:r>
+    </w:p>
+    <w:p>
+      <w:pPr>
+        <w:pStyle w:val="Heading2"/>
+      </w:pPr>
+      <w:r>
+        <w:t>Phụ lục D  Điểm tiếp tục giai đoạn 11</w:t>
+      </w:r>
+    </w:p>
+    <w:p>
+      <w:r>
+        <w:t>Phụ lục D ghi vòng sửa trích xuất và hybrid trước đó. Cập nhật tiếp theo về rerank và lọc bằng chứng nằm tại Phụ lục E. Khi tiếp quản, đọc docs/STAGE11_HANDOFF_VI.md và giữ các thay đổi chưa commit cùng những báo cáo JSON đã lưu.</w:t>
+      </w:r>
+    </w:p>
+    <w:p>
+      <w:pPr>
+        <w:pStyle w:val="Heading3"/>
+      </w:pPr>
+      <w:r>
+        <w:t>Thay đổi và bằng chứng</w:t>
+      </w:r>
+    </w:p>
+    <w:p>
+      <w:pPr>
+        <w:pStyle w:val="ListBullet"/>
+      </w:pPr>
+      <w:r>
+        <w:t>Bộ đọc HTML đã nhận h5/h6 để loại References; giữ các mục triệu chứng ngắn và tách khoảng trắng block/ô bảng. Corpus giảm từ 489 xuống 416 đoạn; chunk ID cũ có thể đổi.</w:t>
+      </w:r>
+    </w:p>
+    <w:p>
+      <w:pPr>
+        <w:pStyle w:val="ListBullet"/>
+      </w:pPr>
+      <w:r>
+        <w:t>Thêm lexical.py, policy.py, compare.py và retrieval_config.json. Search kết hợp embedding gốc, embedding từ khóa Việt–Anh và BM25 với trọng số 2/1/1; RRF dùng hằng số 60 và cửa sổ 80.</w:t>
+      </w:r>
+    </w:p>
+    <w:p>
+      <w:pPr>
+        <w:pStyle w:val="ListBullet"/>
+      </w:pPr>
+      <w:r>
+        <w:t>evaluation_v2.json có 28 câu; mỗi phần dev/test gồm 8 câu có đáp án và 6 câu âm. Gold yêu cầu đúng nguồn, mục và mã băm đoạn. Phần test đã được chạy; không tái sử dụng như một tập chưa từng thấy.</w:t>
+      </w:r>
+    </w:p>
+    <w:p>
+      <w:pPr>
+        <w:pStyle w:val="ListBullet"/>
+      </w:pPr>
+      <w:r>
+        <w:t>Báo cáo cuối lưu tại docs/reference/stage11_20261027. Chạy lại bằng python rag/compare.py --output-dir .temp/stage11_rerun; giữ nguyên thư mục bằng chứng cũ.</w:t>
+      </w:r>
+    </w:p>
+    <w:p>
+      <w:pPr>
+        <w:pStyle w:val="Heading3"/>
+      </w:pPr>
+      <w:r>
+        <w:t>Giới hạn và việc cần làm tiếp</w:t>
+      </w:r>
+    </w:p>
+    <w:p>
+      <w:r>
+        <w:t>Còn trượt hai câu regression về ung thư nguyên phát so với di căn và xác nhận chẩn đoán. Trong V2 test, câu về giải phẫu bệnh chondrosarcoma chưa tìm đúng đoạn trong top 5. Các câu hỏi về xét nghiệm DNA tại nhà bảo đảm phát hiện sớm và thực phẩm chức năng chữa khỏi chordoma vẫn nhận ứng viên dù kho không có bằng chứng phù hợp.</w:t>
+      </w:r>
+    </w:p>
+    <w:p>
+      <w:r>
+        <w:t>Routing hiện chỉ nhận một số mẫu câu; candidates_found chưa phải xác nhận đủ nguồn để trả lời. answer_ready luôn false. Bước tiếp theo là bổ sung nguồn chuyên biệt, thử xếp hạng lại/kiểm tra đủ bằng chứng, định nghĩa tiêu chí nghiệm thu trước lần đo và chuẩn bị tập test mới do người độc lập rà soát. Không chuyển similarity hoặc RRF thành xác suất, không sửa gold để che các ca test trượt.</w:t>
+      </w:r>
+    </w:p>
+    <w:p>
+      <w:r>
+        <w:t>Nếu corpus thay đổi, phải rà soát và gắn lại evidence của V2, sau đó xây lại index và đánh giá. Model, cache và index bị Git bỏ qua; corpus, cấu hình và báo cáo JSON là đầu vào để tái lập. Giai đoạn 12 chỉ nghiệm thu sau khi các giới hạn về retrieval, citation và đủ bằng chứng được kiểm tra.</w:t>
+      </w:r>
+    </w:p>
+    <w:p>
+      <w:r>
+        <w:br w:type="page"/>
+      </w:r>
+    </w:p>
+    <w:p>
+      <w:pPr>
+        <w:pStyle w:val="Heading2"/>
+      </w:pPr>
+      <w:r>
+        <w:t>Phụ lục E  Thử nghiệm xếp hạng và kiểm tra bằng chứng</w:t>
+      </w:r>
+    </w:p>
+    <w:p>
+      <w:r>
+        <w:t>Vòng phát triển bổ sung dùng corpus và model hiện có, không tải model mới. Đã thêm evidence.py, cấu hình khái niệm Việt–Anh, công cụ compare_evidence.py và stress suite V3. Hai tính năng mới đều opt-in; cấu hình hybrid mặc định chưa thay đổi và answer_ready luôn false.</w:t>
+      </w:r>
+    </w:p>
+    <w:p>
+      <w:pPr>
+        <w:pStyle w:val="Heading3"/>
+      </w:pPr>
+      <w:r>
+        <w:t>Kết quả xếp hạng lại</w:t>
+      </w:r>
+    </w:p>
+    <w:p>
+      <w:pPr>
+        <w:pStyle w:val="ListBullet"/>
+      </w:pPr>
+      <w:r>
+        <w:t>Bộ 12 câu cũ: từ 8/10 lên 10/10 câu có đáp án tìm đúng nguồn và mục, MRR@5 = 0,950; không có câu dương bị chặn.</w:t>
+      </w:r>
+    </w:p>
+    <w:p>
+      <w:pPr>
+        <w:pStyle w:val="ListBullet"/>
+      </w:pPr>
+      <w:r>
+        <w:t>V2 dev và test đã xem: từ 6/8 và 7/8 lên 8/8 mỗi phần tìm đúng đoạn; MRR@5 lần lượt 0,813 và 0,938.</w:t>
+      </w:r>
+    </w:p>
+    <w:p>
+      <w:pPr>
+        <w:pStyle w:val="ListBullet"/>
+      </w:pPr>
+      <w:r>
+        <w:t>V3 stress mới gồm 10 câu dương và 10 câu âm Việt/Anh: đúng đoạn từ 8/10 lên 9/10, MRR@5 = 0,750. V3 do cùng AI soạn, có sự kiện trùng nguồn cũ, không phải kiểm định độc lập.</w:t>
+      </w:r>
+    </w:p>
+    <w:p>
+      <w:pPr>
+        <w:pStyle w:val="ListBullet"/>
+      </w:pPr>
+      <w:r>
+        <w:t>Xếp hạng lại không cải thiện từ chối: V2 vẫn 4/6 câu âm mỗi phần, V3 vẫn 0/10. Còn trượt ep08 về triệu chứng Ewing bằng tiếng Việt.</w:t>
+      </w:r>
+    </w:p>
+    <w:p>
+      <w:pPr>
+        <w:pStyle w:val="Heading3"/>
+      </w:pPr>
+      <w:r>
+        <w:t>Phép thử lọc nghiêm ngặt chưa đạt</w:t>
+      </w:r>
+    </w:p>
+    <w:p>
+      <w:r>
+        <w:t>Bộ lọc theo độ phủ từ/cụm từ từ chối toàn bộ câu âm trong phép thử, nhưng cũng chặn nhầm 5/10 câu dương V3 và 8/8 câu dương V2 test đã xem. Nhiều từ tiếng Việt thông dụng chưa có trong danh sách gây từ chối dù corpus có đáp án. Vì vậy tính năng --verify-evidence không đạt mục tiêu nội bộ đã ghi trước lần đo và không được bật mặc định. Có đủ từ trong một đoạn vẫn không chứng minh quan hệ, phủ định, số liệu hoặc kết luận y khoa đúng.</w:t>
+      </w:r>
+    </w:p>
+    <w:p>
+      <w:pPr>
+        <w:pStyle w:val="Heading3"/>
+      </w:pPr>
+      <w:r>
+        <w:t>Bàn giao và việc tiếp theo</w:t>
+      </w:r>
+    </w:p>
+    <w:p>
+      <w:r>
+        <w:t>Kiểm thử RAG hiện đạt 20/20, gồm giữ citation/lọc nguồn và phân biệt đâu với đau, mẫu với máu trước khi bỏ dấu. Báo cáo đầy đủ tại docs/reference/stage11_evidence_rank_20261027; phép thử đầu tiên được giữ riêng tại stage11_evidence_20261027. Lệnh tái lập: python rag/compare_evidence.py --output-dir .temp/evidence_rerun, yêu cầu thư mục mới để tránh ghi đè bằng chứng.</w:t>
+      </w:r>
+    </w:p>
+    <w:p>
+      <w:r>
+        <w:t>Điểm tiếp tục là kiểm tra đủ bằng chứng có xử lý ngôn ngữ tốt hơn, kiểm định rerank bằng tập mới độc lập và bổ sung nguồn cho nhãn thiếu. Không tiếp tục sửa whitelist theo V2/V3 đã xem rồi gọi đó là kiểm định mới. Giai đoạn 11 vẫn chưa nghiệm thu; chi tiết file, số liệu và các ca còn trượt nằm đầu docs/STAGE11_HANDOFF_VI.md. Các bài kiểm thử ứng dụng cũ không chạy lại trong vòng RAG này.</w:t>
       </w:r>
     </w:p>
     <w:sectPr>

</xml_diff>

<commit_message>
Cập nhật corpus RAG và tài liệu dự án
Co-authored-by: Copilot <223556219+Copilot@users.noreply.github.com>
</commit_message>
<xml_diff>
--- a/docs/reports/Bao_cao_tien_do.docx
+++ b/docs/reports/Bao_cao_tien_do.docx
@@ -60,11 +60,7 @@
         <w:jc w:val="center"/>
       </w:pPr>
       <w:r>
-        <w:t>Phiên bản báo cáo: 1.3</w:t>
-        <w:br/>
-        <w:t>Ngày lập: 27/10/2026</w:t>
-        <w:br/>
-        <w:t>Repository: Minh1337/Bone-Xray</w:t>
+        <w:t>Phiên bản báo cáo: 1.7\nNgày lập: 27/10/2026\nRepository: Minh1337/Bone-Xray</w:t>
       </w:r>
     </w:p>
     <w:p>
@@ -368,7 +364,7 @@
         <w:spacing w:after="40"/>
       </w:pPr>
       <w:r>
-        <w:t>**Đã triển khai thêm:** 12 nguồn NCI, hiện 416 đoạn; embedding, BM25, mở rộng Việt–Anh và chỉ mục local.</w:t>
+        <w:t>**Đã triển khai thêm:** 13 nguồn (12 NCI, 1 Open Orthopaedics CC BY 4.0), 439 đoạn; embedding, BM25, mở rộng Việt–Anh và chỉ mục local đã dựng lại.</w:t>
       </w:r>
     </w:p>
     <w:p>
@@ -4032,11 +4028,15 @@
         <w:br/>
         <w:t>Lọc từ vựng: chặn nhầm 5/10 câu dương V3; không đạt</w:t>
         <w:br/>
-        <w:t>Kiểm thử RAG: 20/20 đạt; answer_ready luôn false</w:t>
+        <w:t>Kiểm thử toàn bộ repository: 36 passed, 28 subtests passed; 1 cảnh báo deprecated Starlette</w:t>
         <w:br/>
-        <w:t>Báo cáo: docs/reference/stage11_evidence_rank_20261027</w:t>
+        <w:t>API thật trên CUDA: API_LOCAL_PARITY_PASSED, 3/3 ca; max score delta 0; metadata/hash ảnh khớp; test metadata thiếu/ảnh hỏng đạt</w:t>
         <w:br/>
-        <w:t>Thiếu kiểm định độc lập và kiểm tra đủ bằng chứng</w:t>
+        <w:t>Báo cáo API: api_results/20261027_212246_844539/api_report.json; baseline local, không phải notebook parity</w:t>
+        <w:br/>
+        <w:t>Routing bổ sung cho tuyên bố chưa kiểm chứng đã commit tại d1ef896</w:t>
+        <w:br/>
+        <w:t>answer_ready luôn false; thiếu kiểm định retrieval độc lập và kiểm tra đủ bằng chứng</w:t>
         <w:br/>
         <w:t>Trạng thái: BLOCKED cho chatbot y khoa</w:t>
       </w:r>
@@ -4851,7 +4851,7 @@
     </w:p>
     <w:p>
       <w:r>
-        <w:t>Phụ lục này tổng hợp phần việc sau bản báo cáo 1.0, cập nhật đến vòng giai đoạn 11 của bản 1.2. Chi tiết bàn giao nằm tại docs/PROJECT_STATUS_VI.md và docs/STAGE11_HANDOFF_VI.md.</w:t>
+        <w:t>Phụ lục này tổng hợp phần việc sau bản báo cáo 1.0, cập nhật đến phiên bản 1.5. Chi tiết bàn giao mới nhất nằm tại docs/PROJECT_STATUS_VI.md và docs/STAGE11_HANDOFF_VI.md.</w:t>
       </w:r>
     </w:p>
     <w:p>
@@ -5092,12 +5092,203 @@
     </w:p>
     <w:p>
       <w:r>
-        <w:t>Kiểm thử RAG hiện đạt 20/20, gồm giữ citation/lọc nguồn và phân biệt đâu với đau, mẫu với máu trước khi bỏ dấu. Báo cáo đầy đủ tại docs/reference/stage11_evidence_rank_20261027; phép thử đầu tiên được giữ riêng tại stage11_evidence_20261027. Lệnh tái lập: python rag/compare_evidence.py --output-dir .temp/evidence_rerun, yêu cầu thư mục mới để tránh ghi đè bằng chứng.</w:t>
-      </w:r>
-    </w:p>
-    <w:p>
-      <w:r>
-        <w:t>Điểm tiếp tục là kiểm tra đủ bằng chứng có xử lý ngôn ngữ tốt hơn, kiểm định rerank bằng tập mới độc lập và bổ sung nguồn cho nhãn thiếu. Không tiếp tục sửa whitelist theo V2/V3 đã xem rồi gọi đó là kiểm định mới. Giai đoạn 11 vẫn chưa nghiệm thu; chi tiết file, số liệu và các ca còn trượt nằm đầu docs/STAGE11_HANDOFF_VI.md. Các bài kiểm thử ứng dụng cũ không chạy lại trong vòng RAG này.</w:t>
+        <w:t>Kiểm thử RAG trước đây đạt 20/20; lần xác minh toàn repository ngày 27/10/2026 đạt 36 passed, 28 subtests passed. Commit d1ef896 bổ sung routing cho tuyên bố chữa bệnh không kiểm chứng, bảo đảm chẩn đoán tại nhà, yêu cầu giá ngoài corpus và thiết bị thay chuyên gia; các thay đổi này đã commit.</w:t>
+      </w:r>
+    </w:p>
+    <w:p>
+      <w:r>
+        <w:t>Điểm tiếp tục: kiểm tra quyền tái sử dụng nguồn mới, xác minh ý nghĩa nhãn osteofibroma từ dữ liệu gốc, mở rộng corpus có kiểm soát, rồi đánh giá bằng tập độc lập. AAOS có tài liệu liên quan simple bone cyst và multiple osteochondromas nhưng chưa nhập vì chưa xác nhận điều khoản tái sử dụng. Không đổi corpus/index/gold trong lượt này. Giai đoạn 11 vẫn chưa nghiệm thu; answer_ready luôn false, chưa có chatbot. API parity với baseline local đã đạt 3/3 ca; notebook parity chưa được xác minh.</w:t>
+      </w:r>
+    </w:p>
+    <w:p>
+      <w:pPr>
+        <w:pStyle w:val="Heading2"/>
+      </w:pPr>
+      <w:r>
+        <w:t>Cập nhật bàn giao — 27/10/2026</w:t>
+      </w:r>
+    </w:p>
+    <w:p>
+      <w:r>
+        <w:t>Đã đọc README tiếng Anh/Việt và toàn bộ tài liệu Markdown trong docs/. Repository bắt đầu từ commit d1ef896 trên main, working tree sạch và local branch ahead origin/main một commit. Đã chạy .venv\Scripts\python.exe -m pytest api_tests rag/tests tests ui_tests -q: 36 passed, 28 subtests passed; có một cảnh báo deprecated Starlette. API thật khởi động trên CUDA, verify_api.py đạt API_LOCAL_PARITY_PASSED: 3/3 ca, max score delta 0, metadata/hash ảnh khớp và kiểm tra metadata thiếu/ảnh hỏng đạt. Đây là parity với baseline local, không phải notebook parity.</w:t>
+      </w:r>
+    </w:p>
+    <w:p>
+      <w:r>
+        <w:t>Nguồn chưa ingest: AAOS OrthoInfo, Unicameral Bone Cysts (https://www.orthoinfo.org/diseases--conditions/unicameral-bone-cysts) và Osteochondroma (https://www.orthoinfo.org/diseases--conditions/osteochondroma). Cần xác minh quyền tái sử dụng trước khi đưa toàn văn vào corpus. Không suy diễn rằng nhãn osteofibroma đồng nghĩa osteofibrous dysplasia.</w:t>
+      </w:r>
+    </w:p>
+    <w:p>
+      <w:r>
+        <w:br w:type="page"/>
+      </w:r>
+    </w:p>
+    <w:p>
+      <w:pPr>
+        <w:pStyle w:val="Heading1"/>
+      </w:pPr>
+      <w:r>
+        <w:t>Phụ lục F Cập nhật corpus và đánh giá nguồn mở</w:t>
+      </w:r>
+    </w:p>
+    <w:p>
+      <w:r>
+        <w:t>Ngày cập nhật: 27/10/2026. Phiên này tiếp tục Giai đoạn 11; chưa nghiệm thu chatbot và không bật sinh câu trả lời.</w:t>
+      </w:r>
+    </w:p>
+    <w:p>
+      <w:pPr>
+        <w:pStyle w:val="Heading2"/>
+      </w:pPr>
+      <w:r>
+        <w:t>Thay đổi đã thực hiện</w:t>
+      </w:r>
+    </w:p>
+    <w:p>
+      <w:r>
+        <w:t>Bổ sung bài Injection of Unicameral Bone Cysts with Bone Marrow Aspirate and Demineralized Bone Matrix Avoids Open Curettage and Bone Grafting in a Retrospective Cohort từ The Open Orthopaedics Journal. Metadata gồm tác giả, publisher, ngày, URL, CC BY 4.0 và phạm vi nghiên cứu. Đây là cohort hồi cứu 51 ca nang xương đơn độc vùng đầu trên xương cánh tay, không phải hướng dẫn điều trị tổng quát.</w:t>
+      </w:r>
+    </w:p>
+    <w:p>
+      <w:r>
+        <w:t>Pipeline từ chối nguồn ngoài NCI nếu host, giấy phép CC BY 4.0 hoặc scope chưa được khai báo. Metadata provenance được gắn vào từng chunk; boilerplate và địa chỉ email của trang nguồn bị loại khỏi văn bản truy xuất. Hai nguồn dự kiến khác không được ingest: AAOS có điều khoản tái sử dụng hạn chế; MDPI trả 403 và PMC gặp lỗi chứng thực TLS khi tải toàn văn.</w:t>
+      </w:r>
+    </w:p>
+    <w:p>
+      <w:r>
+        <w:t>Corpus mới gồm 439 đoạn từ 13 nguồn; index local có 439 vector, 384 chiều. SHA-256 corpus: 466a467a7b27dae86ab94b6b76d33d22ef32618a2b2719aeb6f25d3f242b5a15. Các hash corpus trong evaluation_v2 và evaluation_evidence_v3 được cập nhật, không thay câu hỏi hay gold.</w:t>
+      </w:r>
+    </w:p>
+    <w:p>
+      <w:pPr>
+        <w:pStyle w:val="Heading2"/>
+      </w:pPr>
+      <w:r>
+        <w:t>Kết quả kiểm tra</w:t>
+      </w:r>
+    </w:p>
+    <w:p>
+      <w:r>
+        <w:t>Toàn dự án: 37 passed, 28 subtests passed, một cảnh báo deprecation Starlette. RAG: 21 passed, 21 subtests passed. Kết quả đánh giá hồi quy lưu tại docs/reference/stage11_20261027_source_expansion_v1.json.</w:t>
+      </w:r>
+    </w:p>
+    <w:p>
+      <w:r>
+        <w:t>Đánh giá hồi quy V2 sau khi bật policy và gắn lại gold dev n04 theo nguồn mới: Recall@5 14/17, MRR@5 0,688; 11/11 câu âm được từ chối, routing accuracy 28/28. Cấu hình đã đổi nên frozen_config_matches=false. V2 đã xem và không phải kiểm định độc lập. Bộ dev mới 9 câu đạt Recall@5 6/6; 3/3 câu âm được từ chối, nhưng đã dùng để điều chỉnh và không phải tập holdout. Kết quả lưu tại docs/reference/stage11_20261027_config_v2_regression.json và docs/reference/stage11_expansion_dev_v1.json.</w:t>
+      </w:r>
+    </w:p>
+    <w:p>
+      <w:pPr>
+        <w:pStyle w:val="Heading2"/>
+      </w:pPr>
+      <w:r>
+        <w:t>Điểm cần xử lý trước chatbot</w:t>
+      </w:r>
+    </w:p>
+    <w:p>
+      <w:r>
+        <w:t>Sửa retrieval/routing tiếng Việt bằng bộ câu dev mới và đo lại false refusal lẫn false acceptance. Không tuning trên test V2/V3 đã xem rồi gọi kết quả là độc lập. Xác minh nhãn osteofibroma với metadata dataset gốc và người có chuyên môn; tìm nguồn tái sử dụng hợp lệ cho các nhãn còn thiếu. Thiết kế tập đánh giá độc lập và đánh giá kiểm tra đủ bằng chứng theo ngữ nghĩa. Giai đoạn 11 vẫn chưa hoàn tất; chatbot chưa được triển khai.</w:t>
+      </w:r>
+    </w:p>
+    <w:p>
+      <w:r>
+        <w:t>Lệnh tái lập: .\.venv\Scripts\python.exe rag\build_corpus.py --offline; .\.venv\Scripts\python.exe rag\build_index.py; .\.venv\Scripts\python.exe -m pytest api_tests rag/tests tests ui_tests -q.</w:t>
+      </w:r>
+    </w:p>
+    <w:p>
+      <w:r>
+        <w:br w:type="page"/>
+      </w:r>
+    </w:p>
+    <w:p>
+      <w:pPr>
+        <w:pStyle w:val="Heading1"/>
+      </w:pPr>
+      <w:r>
+        <w:t>Phụ lục G Cập nhật retrieval tiếng Việt</w:t>
+      </w:r>
+    </w:p>
+    <w:p>
+      <w:r>
+        <w:t>Ngày cập nhật: 27/10/2026. Đã phát triển tiếp Giai đoạn 11 theo handoff; chưa nghiệm thu chatbot.</w:t>
+      </w:r>
+    </w:p>
+    <w:p>
+      <w:pPr>
+        <w:pStyle w:val="Heading2"/>
+      </w:pPr>
+      <w:r>
+        <w:t>Thay đổi</w:t>
+      </w:r>
+    </w:p>
+    <w:p>
+      <w:r>
+        <w:t>Hybrid vocabulary chuyển sang hybrid-v2. Thêm expansion tiếng Việt và tiếng Anh cho unicameral/simple bone cyst, xương cánh tay, nghiên cứu hồi cứu, cỡ mẫu, tiêm và kết quả tránh mổ mở. `simple bone cyst` được chuyển sang supported vì corpus có nguồn cụ thể; nhãn thiếu bằng chứng như osteofibroma vẫn unsupported. Pipeline loại khối metrics/downloads khỏi trang Open Orthopaedics. Corpus hiện 439 đoạn từ 13 nguồn, hash SHA-256 552eb6b313ca472dc92e5a20280dbf02a39d74091439a895099127c6b96c8dfb; index được dựng lại với 439 vector, 384 chiều.</w:t>
+      </w:r>
+    </w:p>
+    <w:p>
+      <w:r>
+        <w:t>Evaluation V2 dev n04 được gắn lại bằng chứng theo nguồn mới; test split không đổi. Toàn bộ V2 đã xem, dùng làm regression. Snapshot cấu hình gốc không khớp vocabulary mới, nên kết quả ghi frozen_config_matches=false.</w:t>
+      </w:r>
+    </w:p>
+    <w:p>
+      <w:pPr>
+        <w:pStyle w:val="Heading2"/>
+      </w:pPr>
+      <w:r>
+        <w:t>Kết quả</w:t>
+      </w:r>
+    </w:p>
+    <w:p>
+      <w:r>
+        <w:t>Bộ dev riêng gồm 6 câu có đáp án và 3 câu âm đạt Recall@5 6/6, MRR@5 0,639, từ chối/ngoài phạm vi 3/3 và routing accuracy 9/9. V2 hồi quy có policy đạt Recall@5 14/17, MRR@5 0,688, negative abstention 11/11 và routing accuracy 28/28. Bộ dev do AI soạn và đã dùng để điều chỉnh; cả hai báo cáo là bằng chứng kỹ thuật ban đầu, không phải đánh giá độc lập hay xác nhận an toàn y khoa.</w:t>
+      </w:r>
+    </w:p>
+    <w:p>
+      <w:r>
+        <w:t>RAG tests: 23 passed, 24 subtests passed. Full suite after docs and source updates: 39 passed, 31 subtests passed, one Starlette deprecation warning. `answer_ready` remains false; chatbot is not implemented.</w:t>
+      </w:r>
+    </w:p>
+    <w:p>
+      <w:pPr>
+        <w:pStyle w:val="Heading2"/>
+      </w:pPr>
+      <w:r>
+        <w:t>Tiếp tục</w:t>
+      </w:r>
+    </w:p>
+    <w:p>
+      <w:r>
+        <w:t>Tạo tập đánh giá độc lập do người khác soạn/rà soát. Đo retrieval, false refusal và false acceptance trên nhiều nhãn. Xác minh ý nghĩa osteofibroma với metadata dataset gốc và người có chuyên môn; chỉ sau đó mới xem xét nguyên mẫu chatbot.</w:t>
+      </w:r>
+    </w:p>
+    <w:p>
+      <w:pPr>
+        <w:pStyle w:val="Heading1"/>
+        <w:pageBreakBefore/>
+      </w:pPr>
+      <w:r>
+        <w:t>Phụ lục H — Giai đoạn 11A: bộ ảnh tham chiếu BTXRD</w:t>
+      </w:r>
+    </w:p>
+    <w:p>
+      <w:r>
+        <w:t>Nguồn chính thức: BTXRD trên Figshare, DOI 10.6084/m9.figshare.27865398.v1, giấy phép CC BY 4.0. Trích dẫn: Yao et al., Scientific Data 12, 88 (2025), DOI 10.1038/s41597-024-04311-y. Archive BTXRD.zip (840,474,929 byte; Figshare file 50653575) đã được xác minh: MD5 59132a5036d030580ccade8add8f13df; SHA-256 e7c800c3b4e090262b160525a0765f9d93bcc53d639c03806a3ac47b0ded3373.</w:t>
+      </w:r>
+    </w:p>
+    <w:p>
+      <w:r>
+        <w:t>Catalogue có 3.746 ảnh, 22/22 metadata hợp lệ. Có 3.745 nhãn hợp lệ: no-tumor 1.879; osteochondroma 753; multiple osteochondromas 263; simple bone cyst 206; giant cell tumor 93; osteofibroma 44; synovial osteochondroma 50; other bt 115; osteosarcoma 297; other mt 45. Một ảnh IMG001276.jpeg có nhiều subtype cùng bật, được cách ly khỏi scoring, không đoán nhãn. Exact duplicate audit phát hiện 21 nhóm gồm 42 ảnh; đây không phải perceptual duplicate audit.</w:t>
+      </w:r>
+    </w:p>
+    <w:p>
+      <w:r>
+        <w:t>Ảnh, metadata và manifest lưu cục bộ trong data/external_datasets/BTXRD/ (Git-ignore). Công cụ tools/prepare_btxrd_reference.py tạo manifest.csv và summary.json; source register: docs/reference/btxrd_source_register.json. Checkpoint hiện khai báo BTXRD là nguồn huấn luyện, không lưu ID ảnh train/validation/test; BTXRD không được dùng để tuyên bố hiệu năng độc lập. Không có patient/lesion IDs, nên partition để unassigned.</w:t>
+      </w:r>
+    </w:p>
+    <w:p>
+      <w:r>
+        <w:t>Trạng thái: phần thu thập, checksum, provenance, label map, metadata map và catalogue của Giai đoạn 11A hoàn tất. External validation trên ảnh mới còn mở và cần nguồn ngoài BTXRD có quyền sử dụng cùng nhãn chuyên gia. Giai đoạn 11 RAG vẫn chưa nghiệm thu; answer_ready=false, chatbot chưa triển khai. Không có benchmark model nào được chạy trong lượt này.</w:t>
       </w:r>
     </w:p>
     <w:sectPr>

</xml_diff>